<commit_message>
Relazione 2025-26: motiva interviste, prova a due lettori e vademecum
Le interviste sono indicate come non rilevanti per le ipotesi riformulate,
la prova di classificazione con due lettori indipendenti come esito
metodologico di cui la tesi tiene conto, il prontuario-vademecum come
sviluppo successivo alla prosecuzione post-dottorale della ricerca.

Co-Authored-By: Claude Opus 5.5 <noreply@anthropic.com>
Claude-Session: https://claude.ai/code/session_01KmWphT3g4Zm7Sn8osY66MY
</commit_message>
<xml_diff>
--- a/Dottorato/Relazione_annuale_aa2025-26.docx
+++ b/Dottorato/Relazione_annuale_aa2025-26.docx
@@ -421,35 +421,59 @@
         <w:jc w:val="both"/>
       </w:pPr>
       <w:r>
-        <w:t xml:space="preserve">la classificazione quantitativa delle disposizioni è stata sperimentata su un campione, classificato separatamente da due lettori indipendenti; non essendo stata raggiunta la soglia di concordanza fissata in anticipo, le sei funzioni sono state impiegate come criterio di lettura, con regole esplicite che rendono gli argomenti controllabili;</w:t>
-      </w:r>
-    </w:p>
-    <w:p>
-      <w:pPr>
-        <w:pStyle w:val="ListParagraph"/>
-        <w:numPr>
-          <w:ilvl w:val="0"/>
-          <w:numId w:val="2"/>
-        </w:numPr>
-        <w:spacing w:after="80" w:line="300"/>
-        <w:jc w:val="both"/>
-      </w:pPr>
-      <w:r>
-        <w:t xml:space="preserve">l’applicazione effettiva delle disposizioni è stata studiata attraverso la giurisprudenza, i provvedimenti delle autorità e i casi di studio, mentre la rilevazione diretta presso le organizzazioni mediante interviste, prevista dal progetto, è stata rinviata al programma di ricerca post-dottorale, anche in considerazione dei limiti di accesso al campo già evidenziati nel progetto;</w:t>
-      </w:r>
-    </w:p>
-    <w:p>
-      <w:pPr>
-        <w:pStyle w:val="ListParagraph"/>
-        <w:numPr>
-          <w:ilvl w:val="0"/>
-          <w:numId w:val="2"/>
-        </w:numPr>
-        <w:spacing w:after="80" w:line="300"/>
-        <w:jc w:val="both"/>
-      </w:pPr>
-      <w:r>
-        <w:t xml:space="preserve">la comparazione, che il progetto prospettava con riferimento a ordinamenti quali quelli statunitense e canadese, è stata condotta con l’ordinamento brasiliano, preferito perché la capacità della griglia di analisi di distinguere gli obblighi si misura meglio su un ordinamento che non ha contribuito a formarla, e perché la disciplina brasiliana, pur ispirata al GDPR, presenta formanti propri (giurisprudenziale, costituzionale e regolamentare) che consentono di osservare fenomeni di convergenza, ibridazione e resistenza.</w:t>
+        <w:t xml:space="preserve">le interviste semi-strutturate a esperti di sicurezza informatica e a responsabili della sicurezza delle informazioni, previste dal progetto, sono risultate in corso d’opera non rilevanti ai fini della verifica delle ipotesi così riformulate, il cui oggetto è divenuto la struttura degli obblighi imposti dai testi normativi, che non può essere accertata attraverso le percezioni degli operatori. L’attività di ricerca è stata perciò indirizzata all’analisi del corpus normativo, mentre l’applicazione effettiva delle disposizioni è stata studiata attraverso la giurisprudenza, i provvedimenti delle autorità e i casi di studio. La rilevazione sul campo delle pratiche organizzative conserva invece interesse per misurare l’effettività degli obblighi, e la tesi la colloca nel programma empirico della ricerca post-dottorale;</w:t>
+      </w:r>
+    </w:p>
+    <w:p>
+      <w:pPr>
+        <w:pStyle w:val="ListParagraph"/>
+        <w:numPr>
+          <w:ilvl w:val="0"/>
+          <w:numId w:val="2"/>
+        </w:numPr>
+        <w:spacing w:after="80" w:line="300"/>
+        <w:jc w:val="both"/>
+      </w:pPr>
+      <w:r>
+        <w:t xml:space="preserve">in luogo della rilevazione mediante interviste, la verifica è stata impostata su una classificazione del corpus normativo secondo regole scritte, sperimentata su un campione di disposizioni classificato separatamente da due lettori indipendenti. La prova ha prodotto un risultato di cui la tesi tiene espressamente conto: la concordanza fra i due lettori non ha raggiunto, su nessuna delle variabili considerate, la soglia fissata in anticipo, sicché la classificazione dell’intero corpus non è stata eseguita e le sei funzioni sono state impiegate come criterio di lettura dichiarato, con regole esplicite enunciate all’apertura della Parte III. Il risultato ha inciso sul giudizio sulle ipotesi, formulato su argomenti controllabili anziché su misure, e costituisce esso stesso un esito metodologico della ricerca, perché mostra che una classificazione giuridica che richiede molte valutazioni interpretative non si trasmette fra lettori indipendenti attraverso le sole regole scritte; la tesi indica inoltre le condizioni per una replica della prova (lettori addestrati sulle regole, campione stratificato, confronto in due fasi);</w:t>
+      </w:r>
+    </w:p>
+    <w:p>
+      <w:pPr>
+        <w:pStyle w:val="ListParagraph"/>
+        <w:numPr>
+          <w:ilvl w:val="0"/>
+          <w:numId w:val="2"/>
+        </w:numPr>
+        <w:spacing w:after="80" w:line="300"/>
+        <w:jc w:val="both"/>
+      </w:pPr>
+      <w:r>
+        <w:t xml:space="preserve">la comparazione, che il progetto prospettava con riferimento a ordinamenti quali quelli statunitense e canadese, è stata condotta con l’ordinamento brasiliano, preferito perché la capacità della griglia di analisi di distinguere gli obblighi si misura meglio su un ordinamento che non ha contribuito a formarla, e perché la disciplina brasiliana, pur ispirata al GDPR, presenta formanti propri (giurisprudenziale, costituzionale e regolamentare) che consentono di osservare fenomeni di convergenza, ibridazione e resistenza;</w:t>
+      </w:r>
+    </w:p>
+    <w:p>
+      <w:pPr>
+        <w:pStyle w:val="ListParagraph"/>
+        <w:numPr>
+          <w:ilvl w:val="0"/>
+          <w:numId w:val="2"/>
+        </w:numPr>
+        <w:spacing w:after="80" w:line="300"/>
+        <w:jc w:val="both"/>
+      </w:pPr>
+      <w:r>
+        <w:t xml:space="preserve">il prontuario-vademecum per la gestione dei data breach, che il cronoprogramma collocava nell’ultima parte del terzo anno, non è stato inserito nell’elaborato. Le indicazioni operative che esso dovrebbe contenere possono trarre origine dall’ultima parte della tesi, e in particolare dai casi di studio, che declinano le sei funzioni in obblighi concreti di imprese e amministrazioni, e dalle proposte </w:t>
+      </w:r>
+      <w:r>
+        <w:rPr>
+          <w:i/>
+          <w:iCs/>
+        </w:rPr>
+        <w:t xml:space="preserve">de iure condendo</w:t>
+      </w:r>
+      <w:r>
+        <w:t xml:space="preserve">; la loro traduzione in uno strumento pratico appare tuttavia più utile all’esito dell’eventuale prosecuzione post-dottorale della ricerca, quando il programma empirico avrà consentito di verificare sul campo le pratiche delle organizzazioni e di monitorare l’attuazione delle discipline più recenti, molte delle quali sono entrate in vigore soltanto negli ultimi mesi del triennio.</w:t>
       </w:r>
     </w:p>
     <w:p>

</xml_diff>

<commit_message>
Indica la sede dell'audizione sull'A.G. 418 (Commissioni riunite I e II)
Co-Authored-By: Claude Opus 5.5 <noreply@anthropic.com>
Claude-Session: https://claude.ai/code/session_01KmWphT3g4Zm7Sn8osY66MY
</commit_message>
<xml_diff>
--- a/Dottorato/Relazione_annuale_aa2025-26.docx
+++ b/Dottorato/Relazione_annuale_aa2025-26.docx
@@ -579,17 +579,7 @@
         <w:jc w:val="both"/>
       </w:pPr>
       <w:r>
-        <w:t xml:space="preserve">22 luglio 2026 – Relazione per l’audizione sullo schema di decreto legislativo A.G. n. 418, relativo all’impiego dell’intelligenza artificiale nelle attività di polizia </w:t>
-      </w:r>
-      <w:r>
-        <w:rPr>
-          <w:highlight w:val="yellow"/>
-          <w:highlightCs w:val="yellow"/>
-        </w:rPr>
-        <w:t xml:space="preserve">[indicare la Commissione parlamentare]</w:t>
-      </w:r>
-      <w:r>
-        <w:t xml:space="preserve">;</w:t>
+        <w:t xml:space="preserve">22 luglio 2026 – Roma (in videoconferenza). Audizione informale presso le Commissioni riunite I (Affari costituzionali) e II (Giustizia) della Camera dei deputati, nell’ambito dell’esame dello schema di decreto legislativo A.G. n. 418, relativo all’impiego dei sistemi di intelligenza artificiale nelle attività di polizia, in adeguamento al regolamento (UE) 2024/1689, con deposito di una relazione scritta;</w:t>
       </w:r>
     </w:p>
     <w:p>
@@ -676,7 +666,7 @@
         <w:t xml:space="preserve">Relazione per l’audizione. Schema di decreto legislativo A.G. n. 418, impiego dell’intelligenza artificiale nelle attività di polizia</w:t>
       </w:r>
       <w:r>
-        <w:t xml:space="preserve">, 22 luglio 2026;</w:t>
+        <w:t xml:space="preserve">, Camera dei deputati, Commissioni riunite I (Affari costituzionali) e II (Giustizia), 22 luglio 2026;</w:t>
       </w:r>
     </w:p>
     <w:p>

</xml_diff>

<commit_message>
Corregge la sede dell'audizione sull'A.G. 418: XIV Commissione
Co-Authored-By: Claude Opus 5.5 <noreply@anthropic.com>
Claude-Session: https://claude.ai/code/session_01KmWphT3g4Zm7Sn8osY66MY
</commit_message>
<xml_diff>
--- a/Dottorato/Relazione_annuale_aa2025-26.docx
+++ b/Dottorato/Relazione_annuale_aa2025-26.docx
@@ -579,7 +579,7 @@
         <w:jc w:val="both"/>
       </w:pPr>
       <w:r>
-        <w:t xml:space="preserve">22 luglio 2026 – Roma (in videoconferenza). Audizione informale presso le Commissioni riunite I (Affari costituzionali) e II (Giustizia) della Camera dei deputati, nell’ambito dell’esame dello schema di decreto legislativo A.G. n. 418, relativo all’impiego dei sistemi di intelligenza artificiale nelle attività di polizia, in adeguamento al regolamento (UE) 2024/1689, con deposito di una relazione scritta;</w:t>
+        <w:t xml:space="preserve">22 luglio 2026 – Roma (in videoconferenza). Audizione informale presso la XIV Commissione (Politiche dell’Unione europea) della Camera dei deputati, nell’ambito dell’esame dello schema di decreto legislativo A.G. n. 418, relativo all’impiego dei sistemi di intelligenza artificiale nelle attività di polizia, in adeguamento al regolamento (UE) 2024/1689, con deposito di una relazione scritta;</w:t>
       </w:r>
     </w:p>
     <w:p>
@@ -666,7 +666,7 @@
         <w:t xml:space="preserve">Relazione per l’audizione. Schema di decreto legislativo A.G. n. 418, impiego dell’intelligenza artificiale nelle attività di polizia</w:t>
       </w:r>
       <w:r>
-        <w:t xml:space="preserve">, Camera dei deputati, Commissioni riunite I (Affari costituzionali) e II (Giustizia), 22 luglio 2026;</w:t>
+        <w:t xml:space="preserve">, Camera dei deputati, XIV Commissione (Politiche dell’Unione europea), 22 luglio 2026;</w:t>
       </w:r>
     </w:p>
     <w:p>

</xml_diff>